<commit_message>
feat(artefact-1): enrich §5 Architecture with lecture-based framework
Добавлены новые подразделы на основе лекции «Архитектура AI-решений»:
- §5.0 Обоснование выбора паттерна (Agent) через decision framework
- §5.0a AI-специфичные NFR (accuracy, hallucination tolerance, explainability, freshness, privacy)
- §5.6 Наблюдаемость (JSONL-логи, per-session metrics, alerting)
- §5.7 Архитектурные компромиссы (модель, web_search, хранение, оркестрация)
- §6.3 расширен до Топ-5 рисков — добавлены prompt injection и утечка через логи

Обновлены заголовки в docx: §5, §5.5, §6.3 приведены в соответствие с MD.

Co-Authored-By: Claude Sonnet 4.6 <noreply@anthropic.com>
</commit_message>
<xml_diff>
--- a/artefacts/artefact-1-spec/ТЗ_Ревизор_День1.docx
+++ b/artefacts/artefact-1-spec/ТЗ_Ревизор_День1.docx
@@ -2579,7 +2579,7 @@
           <ns0:color ns0:val="1F4E79"/>
           <ns0:lang ns0:val="ru-RU"/>
         </ns0:rPr>
-        <ns0:t ns2:_id="vyd:0000000000013u">5. Архитектура решения и согласование с требованиями</ns0:t>
+        <ns0:t ns2:_id="vyd:0000000000013u">5. Архитектура решения</ns0:t>
       </ns0:r>
     </ns0:p>
     <ns0:p ns3:paraId="07EABF61" ns3:textId="77777777" ns0:rsidR="00270EF2" ns0:rsidRPr="00AB12F6" ns0:rsidRDefault="00000000" ns2:_id="vyd:0000000000013p">
@@ -2616,6 +2616,210 @@
           <ns0:lang ns0:val="ru-RU"/>
         </ns0:rPr>
         <ns0:t ns2:_id="vyd:0000000000013q" xml:space="preserve"> → компоненты → технологии.</ns0:t>
+      </ns0:r>
+    </ns0:p>
+    <ns0:p ns3:paraId="AA000001" ns3:textId="77777777" ns0:rsidR="00270EF2" ns0:rsidRDefault="00000000">
+      <ns0:pPr>
+        <ns0:pStyle ns0:val="31"/>
+        <ns0:rPr>
+          <ns0:lang ns0:val="ru-RU"/>
+        </ns0:rPr>
+      </ns0:pPr>
+      <ns0:r>
+        <ns0:rPr>
+          <ns0:color ns0:val="1F4E79"/>
+          <ns0:lang ns0:val="ru-RU"/>
+        </ns0:rPr>
+        <ns0:t>5.0. Обоснование выбора архитектурного паттерна</ns0:t>
+      </ns0:r>
+    </ns0:p>
+    <ns0:p ns3:paraId="AA000002" ns3:textId="77777777" ns0:rsidR="00270EF2" ns0:rsidRDefault="00000000">
+      <ns0:pPr>
+        <ns0:rPr>
+          <ns0:lang ns0:val="ru-RU"/>
+        </ns0:rPr>
+      </ns0:pPr>
+      <ns0:r>
+        <ns0:rPr>
+          <ns0:lang ns0:val="ru-RU"/>
+        </ns0:rPr>
+        <ns0:t xml:space="preserve">Для выбора паттерна применяем фреймворк решений из лекции «Архитектура AI-решений»:</ns0:t>
+      </ns0:r>
+    </ns0:p>
+    <ns0:p ns3:paraId="AA000003" ns3:textId="77777777" ns0:rsidR="00270EF2" ns0:rsidRDefault="00000000">
+      <ns0:pPr>
+        <ns0:pStyle ns0:val="a0"/>
+        <ns0:ind ns0:start="283"/>
+        <ns0:rPr>
+          <ns0:lang ns0:val="ru-RU"/>
+        </ns0:rPr>
+      </ns0:pPr>
+      <ns0:r>
+        <ns0:rPr>
+          <ns0:lang ns0:val="ru-RU"/>
+        </ns0:rPr>
+        <ns0:t xml:space="preserve">Размеченных данных для обучения нет → исключаем ML / fine-tune</ns0:t>
+      </ns0:r>
+    </ns0:p>
+    <ns0:p ns3:paraId="AA000003" ns3:textId="77777777" ns0:rsidR="00270EF2" ns0:rsidRDefault="00000000">
+      <ns0:pPr>
+        <ns0:pStyle ns0:val="a0"/>
+        <ns0:ind ns0:start="283"/>
+        <ns0:rPr>
+          <ns0:lang ns0:val="ru-RU"/>
+        </ns0:rPr>
+      </ns0:pPr>
+      <ns0:r>
+        <ns0:rPr>
+          <ns0:lang ns0:val="ru-RU"/>
+        </ns0:rPr>
+        <ns0:t xml:space="preserve">Каталог услуг (15–20 позиций) помещается в контекст → полноценный RAG избыточен</ns0:t>
+      </ns0:r>
+    </ns0:p>
+    <ns0:p ns3:paraId="AA000003" ns3:textId="77777777" ns0:rsidR="00270EF2" ns0:rsidRDefault="00000000">
+      <ns0:pPr>
+        <ns0:pStyle ns0:val="a0"/>
+        <ns0:ind ns0:start="283"/>
+        <ns0:rPr>
+          <ns0:lang ns0:val="ru-RU"/>
+        </ns0:rPr>
+      </ns0:pPr>
+      <ns0:r>
+        <ns0:rPr>
+          <ns0:lang ns0:val="ru-RU"/>
+        </ns0:rPr>
+        <ns0:t xml:space="preserve">Задача требует 5+ шагов с tool_use → нужна оркестрация → паттерн Agent</ns0:t>
+      </ns0:r>
+    </ns0:p>
+    <ns0:p ns3:paraId="AA000002" ns3:textId="77777777" ns0:rsidR="00270EF2" ns0:rsidRDefault="00000000">
+      <ns0:pPr>
+        <ns0:rPr>
+          <ns0:lang ns0:val="ru-RU"/>
+        </ns0:rPr>
+      </ns0:pPr>
+      <ns0:r>
+        <ns0:rPr>
+          <ns0:lang ns0:val="ru-RU"/>
+        </ns0:rPr>
+        <ns0:t xml:space="preserve">Выбранный паттерн: Agent (multi-step prompt chain). Четыре явных шага: survey → profile → audit → proposal, каждый с контрактом ввода/вывода в JSON. Шаг enrichment использует web_search tool при отсутствии документа.</ns0:t>
+      </ns0:r>
+    </ns0:p>
+    <ns0:p ns3:paraId="AA000002" ns3:textId="77777777" ns0:rsidR="00270EF2" ns0:rsidRDefault="00000000">
+      <ns0:pPr>
+        <ns0:rPr>
+          <ns0:lang ns0:val="ru-RU"/>
+        </ns0:rPr>
+      </ns0:pPr>
+      <ns0:r>
+        <ns0:rPr>
+          <ns0:lang ns0:val="ru-RU"/>
+        </ns0:rPr>
+        <ns0:t xml:space="preserve">Отклонённые альтернативы: Prompt-only — задача слишком сложна для одного промпта. RAG — размер каталога не требует векторного поиска. Hybrid RAG+Agent — в roadmap при росте каталога.</ns0:t>
+      </ns0:r>
+    </ns0:p>
+    <ns0:p ns3:paraId="AA000001" ns3:textId="77777777" ns0:rsidR="00270EF2" ns0:rsidRDefault="00000000">
+      <ns0:pPr>
+        <ns0:pStyle ns0:val="31"/>
+        <ns0:rPr>
+          <ns0:lang ns0:val="ru-RU"/>
+        </ns0:rPr>
+      </ns0:pPr>
+      <ns0:r>
+        <ns0:rPr>
+          <ns0:color ns0:val="1F4E79"/>
+          <ns0:lang ns0:val="ru-RU"/>
+        </ns0:rPr>
+        <ns0:t>5.0a. AI-специфичные нефункциональные требования</ns0:t>
+      </ns0:r>
+    </ns0:p>
+    <ns0:p ns3:paraId="AA000003" ns3:textId="77777777" ns0:rsidR="00270EF2" ns0:rsidRDefault="00000000">
+      <ns0:pPr>
+        <ns0:pStyle ns0:val="a0"/>
+        <ns0:ind ns0:start="283"/>
+        <ns0:rPr>
+          <ns0:lang ns0:val="ru-RU"/>
+        </ns0:rPr>
+      </ns0:pPr>
+      <ns0:r>
+        <ns0:rPr>
+          <ns0:lang ns0:val="ru-RU"/>
+        </ns0:rPr>
+        <ns0:t xml:space="preserve">Порог точности: ≥80% релевантность подбора услуг (ручная проверка по 5 тест-профилям)</ns0:t>
+      </ns0:r>
+    </ns0:p>
+    <ns0:p ns3:paraId="AA000003" ns3:textId="77777777" ns0:rsidR="00270EF2" ns0:rsidRDefault="00000000">
+      <ns0:pPr>
+        <ns0:pStyle ns0:val="a0"/>
+        <ns0:ind ns0:start="283"/>
+        <ns0:rPr>
+          <ns0:lang ns0:val="ru-RU"/>
+        </ns0:rPr>
+      </ns0:pPr>
+      <ns0:r>
+        <ns0:rPr>
+          <ns0:lang ns0:val="ru-RU"/>
+        </ns0:rPr>
+        <ns0:t xml:space="preserve">Толерантность к галлюцинациям: LOW — числовые ROI и цены в КП (жёсткий JSON-контракт); MEDIUM — описания рисков и нарративные блоки</ns0:t>
+      </ns0:r>
+    </ns0:p>
+    <ns0:p ns3:paraId="AA000003" ns3:textId="77777777" ns0:rsidR="00270EF2" ns0:rsidRDefault="00000000">
+      <ns0:pPr>
+        <ns0:pStyle ns0:val="a0"/>
+        <ns0:ind ns0:start="283"/>
+        <ns0:rPr>
+          <ns0:lang ns0:val="ru-RU"/>
+        </ns0:rPr>
+      </ns0:pPr>
+      <ns0:r>
+        <ns0:rPr>
+          <ns0:lang ns0:val="ru-RU"/>
+        </ns0:rPr>
+        <ns0:t xml:space="preserve">Объяснимость: каждая из 5 зон сопровождается текстовым обоснованием; явная пометка источника данных (опрос / документ / open data)</ns0:t>
+      </ns0:r>
+    </ns0:p>
+    <ns0:p ns3:paraId="AA000003" ns3:textId="77777777" ns0:rsidR="00270EF2" ns0:rsidRDefault="00000000">
+      <ns0:pPr>
+        <ns0:pStyle ns0:val="a0"/>
+        <ns0:ind ns0:start="283"/>
+        <ns0:rPr>
+          <ns0:lang ns0:val="ru-RU"/>
+        </ns0:rPr>
+      </ns0:pPr>
+      <ns0:r>
+        <ns0:rPr>
+          <ns0:lang ns0:val="ru-RU"/>
+        </ns0:rPr>
+        <ns0:t xml:space="preserve">Актуальность: документ клиента — в рамках текущей сессии; web_search — в момент анализа (не кэшируется)</ns0:t>
+      </ns0:r>
+    </ns0:p>
+    <ns0:p ns3:paraId="AA000003" ns3:textId="77777777" ns0:rsidR="00270EF2" ns0:rsidRDefault="00000000">
+      <ns0:pPr>
+        <ns0:pStyle ns0:val="a0"/>
+        <ns0:ind ns0:start="283"/>
+        <ns0:rPr>
+          <ns0:lang ns0:val="ru-RU"/>
+        </ns0:rPr>
+      </ns0:pPr>
+      <ns0:r>
+        <ns0:rPr>
+          <ns0:lang ns0:val="ru-RU"/>
+        </ns0:rPr>
+        <ns0:t xml:space="preserve">Приватность: документ только in-memory, не логируется; ФИО из документов игнорируются при анализе</ns0:t>
+      </ns0:r>
+    </ns0:p>
+    <ns0:p ns3:paraId="AA000003" ns3:textId="77777777" ns0:rsidR="00270EF2" ns0:rsidRDefault="00000000">
+      <ns0:pPr>
+        <ns0:pStyle ns0:val="a0"/>
+        <ns0:ind ns0:start="283"/>
+        <ns0:rPr>
+          <ns0:lang ns0:val="ru-RU"/>
+        </ns0:rPr>
+      </ns0:pPr>
+      <ns0:r>
+        <ns0:rPr>
+          <ns0:lang ns0:val="ru-RU"/>
+        </ns0:rPr>
+        <ns0:t xml:space="preserve">Деградация: при недоступности web_search → анализ по опросу + явное предупреждение; при нераспознанном документе → то же</ns0:t>
       </ns0:r>
     </ns0:p>
     <ns0:p ns3:paraId="53BC9659" ns3:textId="77777777" ns0:rsidR="00270EF2" ns0:rsidRPr="00AB12F6" ns0:rsidRDefault="00000000" ns2:_id="vyd:0000000000013n">
@@ -3368,33 +3572,7 @@
           <ns0:color ns0:val="1F4E79"/>
           <ns0:lang ns0:val="ru-RU"/>
         </ns0:rPr>
-        <ns0:t ns2:_id="vyd:000000000000zs" xml:space="preserve">5.5. Используемые решения Сбера и </ns0:t>
-      </ns0:r>
-      <ns0:r>
-        <ns0:rPr>
-          <ns0:color ns0:val="1F4E79"/>
-        </ns0:rPr>
-        <ns0:t ns2:_id="vyd:000000000000zr">Low</ns0:t>
-      </ns0:r>
-      <ns0:r>
-        <ns0:rPr>
-          <ns0:color ns0:val="1F4E79"/>
-          <ns0:lang ns0:val="ru-RU"/>
-        </ns0:rPr>
-        <ns0:t ns2:_id="vyd:000000000000zq">-</ns0:t>
-      </ns0:r>
-      <ns0:r>
-        <ns0:rPr>
-          <ns0:color ns0:val="1F4E79"/>
-        </ns0:rPr>
-        <ns0:t ns2:_id="vyd:000000000000zp">code</ns0:t>
-      </ns0:r>
-      <ns0:r>
-        <ns0:rPr>
-          <ns0:color ns0:val="1F4E79"/>
-          <ns0:lang ns0:val="ru-RU"/>
-        </ns0:rPr>
-        <ns0:t ns2:_id="vyd:000000000000zo" xml:space="preserve"> инструменты</ns0:t>
+        <ns0:t ns2:_id="vyd:000000000000zs">5.5. Используемые инструменты</ns0:t>
       </ns0:r>
     </ns0:p>
     <ns0:p ns3:paraId="4A45BDA4" ns3:textId="77777777" ns0:rsidR="00270EF2" ns0:rsidRPr="00AB12F6" ns0:rsidRDefault="00000000" ns2:_id="vyd:000000000000z1">
@@ -3811,6 +3989,184 @@
         <ns0:br ns0:type="page" ns2:_id="vyd:000000000000xu"/>
       </ns0:r>
     </ns0:p>
+    <ns0:p ns3:paraId="AA000001" ns3:textId="77777777" ns0:rsidR="00270EF2" ns0:rsidRDefault="00000000">
+      <ns0:pPr>
+        <ns0:pStyle ns0:val="31"/>
+        <ns0:rPr>
+          <ns0:lang ns0:val="ru-RU"/>
+        </ns0:rPr>
+      </ns0:pPr>
+      <ns0:r>
+        <ns0:rPr>
+          <ns0:color ns0:val="1F4E79"/>
+          <ns0:lang ns0:val="ru-RU"/>
+        </ns0:rPr>
+        <ns0:t>5.6. Наблюдаемость (Observability)</ns0:t>
+      </ns0:r>
+    </ns0:p>
+    <ns0:p ns3:paraId="AA000002" ns3:textId="77777777" ns0:rsidR="00270EF2" ns0:rsidRDefault="00000000">
+      <ns0:pPr>
+        <ns0:rPr>
+          <ns0:lang ns0:val="ru-RU"/>
+        </ns0:rPr>
+      </ns0:pPr>
+      <ns0:r>
+        <ns0:rPr>
+          <ns0:lang ns0:val="ru-RU"/>
+        </ns0:rPr>
+        <ns0:t xml:space="preserve">Принцип: «Если нет логов — нет отладки AI». Каждый шаг пайплайна пишет JSONL-запись:</ns0:t>
+      </ns0:r>
+    </ns0:p>
+    <ns0:p ns3:paraId="AA000003" ns3:textId="77777777" ns0:rsidR="00270EF2" ns0:rsidRDefault="00000000">
+      <ns0:pPr>
+        <ns0:pStyle ns0:val="a0"/>
+        <ns0:ind ns0:start="283"/>
+        <ns0:rPr>
+          <ns0:lang ns0:val="ru-RU"/>
+        </ns0:rPr>
+      </ns0:pPr>
+      <ns0:r>
+        <ns0:rPr>
+          <ns0:lang ns0:val="ru-RU"/>
+        </ns0:rPr>
+        <ns0:t xml:space="preserve">Поля записи: trace_id, step (survey/profile/enrichment/audit/proposal), timestamp, latency_ms, tokens_in, tokens_out, cost_usd, model, fallback_used, status</ns0:t>
+      </ns0:r>
+    </ns0:p>
+    <ns0:p ns3:paraId="AA000003" ns3:textId="77777777" ns0:rsidR="00270EF2" ns0:rsidRDefault="00000000">
+      <ns0:pPr>
+        <ns0:pStyle ns0:val="a0"/>
+        <ns0:ind ns0:start="283"/>
+        <ns0:rPr>
+          <ns0:lang ns0:val="ru-RU"/>
+        </ns0:rPr>
+      </ns0:pPr>
+      <ns0:r>
+        <ns0:rPr>
+          <ns0:lang ns0:val="ru-RU"/>
+        </ns0:rPr>
+        <ns0:t xml:space="preserve">Метрики per-session: total_cost_usd (целевой ориентир &lt;=$0.20/аудит), total_latency_ms, fallback_rate (доля сессий где web_search не дал контекст), partial_diagnosis_rate (профиль &lt; 5 ответов)</ns0:t>
+      </ns0:r>
+    </ns0:p>
+    <ns0:p ns3:paraId="AA000003" ns3:textId="77777777" ns0:rsidR="00270EF2" ns0:rsidRDefault="00000000">
+      <ns0:pPr>
+        <ns0:pStyle ns0:val="a0"/>
+        <ns0:ind ns0:start="283"/>
+        <ns0:rPr>
+          <ns0:lang ns0:val="ru-RU"/>
+        </ns0:rPr>
+      </ns0:pPr>
+      <ns0:r>
+        <ns0:rPr>
+          <ns0:lang ns0:val="ru-RU"/>
+        </ns0:rPr>
+        <ns0:t xml:space="preserve">Alerting (MVP — консоль; продакшен — Grafana/Sentry): latency диагностики p95 &gt; 3 мин → warning; status==error на шаге audit → автоматический retry × 1 → graceful error</ns0:t>
+      </ns0:r>
+    </ns0:p>
+    <ns0:p ns3:paraId="AA000001" ns3:textId="77777777" ns0:rsidR="00270EF2" ns0:rsidRDefault="00000000">
+      <ns0:pPr>
+        <ns0:pStyle ns0:val="31"/>
+        <ns0:rPr>
+          <ns0:lang ns0:val="ru-RU"/>
+        </ns0:rPr>
+      </ns0:pPr>
+      <ns0:r>
+        <ns0:rPr>
+          <ns0:color ns0:val="1F4E79"/>
+          <ns0:lang ns0:val="ru-RU"/>
+        </ns0:rPr>
+        <ns0:t>5.7. Архитектурные компромиссы (Trade-offs)</ns0:t>
+      </ns0:r>
+    </ns0:p>
+    <ns0:p ns3:paraId="AA000003" ns3:textId="77777777" ns0:rsidR="00270EF2" ns0:rsidRDefault="00000000">
+      <ns0:pPr>
+        <ns0:pStyle ns0:val="a0"/>
+        <ns0:ind ns0:start="283"/>
+        <ns0:rPr>
+          <ns0:lang ns0:val="ru-RU"/>
+        </ns0:rPr>
+      </ns0:pPr>
+      <ns0:r>
+        <ns0:rPr>
+          <ns0:lang ns0:val="ru-RU"/>
+        </ns0:rPr>
+        <ns0:t xml:space="preserve">Модель: Claude Sonnet 4.6 (выбрано) vs Claude Haiku 3.5 — качество JSON-вывода и понимания бизнес-контекста критично; Haiku сэкономит ~70% стоимости, но риск потери качества аудита высок</ns0:t>
+      </ns0:r>
+    </ns0:p>
+    <ns0:p ns3:paraId="AA000003" ns3:textId="77777777" ns0:rsidR="00270EF2" ns0:rsidRDefault="00000000">
+      <ns0:pPr>
+        <ns0:pStyle ns0:val="a0"/>
+        <ns0:ind ns0:start="283"/>
+        <ns0:rPr>
+          <ns0:lang ns0:val="ru-RU"/>
+        </ns0:rPr>
+      </ns0:pPr>
+      <ns0:r>
+        <ns0:rPr>
+          <ns0:lang ns0:val="ru-RU"/>
+        </ns0:rPr>
+        <ns0:t xml:space="preserve">Без документа: web_search enrichment (выбрано) vs только опрос — полнота диагностики выше; явная маркировка источника снимает риск галлюцинаций</ns0:t>
+      </ns0:r>
+    </ns0:p>
+    <ns0:p ns3:paraId="AA000003" ns3:textId="77777777" ns0:rsidR="00270EF2" ns0:rsidRDefault="00000000">
+      <ns0:pPr>
+        <ns0:pStyle ns0:val="a0"/>
+        <ns0:ind ns0:start="283"/>
+        <ns0:rPr>
+          <ns0:lang ns0:val="ru-RU"/>
+        </ns0:rPr>
+      </ns0:pPr>
+      <ns0:r>
+        <ns0:rPr>
+          <ns0:lang ns0:val="ru-RU"/>
+        </ns0:rPr>
+        <ns0:t xml:space="preserve">web_search: включён по умолчанию с graceful fallback (выбрано) vs отключён — ценность для клиентов без документов высока</ns0:t>
+      </ns0:r>
+    </ns0:p>
+    <ns0:p ns3:paraId="AA000003" ns3:textId="77777777" ns0:rsidR="00270EF2" ns0:rsidRDefault="00000000">
+      <ns0:pPr>
+        <ns0:pStyle ns0:val="a0"/>
+        <ns0:ind ns0:start="283"/>
+        <ns0:rPr>
+          <ns0:lang ns0:val="ru-RU"/>
+        </ns0:rPr>
+      </ns0:pPr>
+      <ns0:r>
+        <ns0:rPr>
+          <ns0:lang ns0:val="ru-RU"/>
+        </ns0:rPr>
+        <ns0:t xml:space="preserve">Хранение документа: in-memory (выбрано) vs S3/БД — меньше инфраструктуры, GDPR-compliant из коробки для MVP</ns0:t>
+      </ns0:r>
+    </ns0:p>
+    <ns0:p ns3:paraId="AA000003" ns3:textId="77777777" ns0:rsidR="00270EF2" ns0:rsidRDefault="00000000">
+      <ns0:pPr>
+        <ns0:pStyle ns0:val="a0"/>
+        <ns0:ind ns0:start="283"/>
+        <ns0:rPr>
+          <ns0:lang ns0:val="ru-RU"/>
+        </ns0:rPr>
+      </ns0:pPr>
+      <ns0:r>
+        <ns0:rPr>
+          <ns0:lang ns0:val="ru-RU"/>
+        </ns0:rPr>
+        <ns0:t xml:space="preserve">КП: PDF/weasyprint (выбрано) vs PPTX — PDF проще в MVP; PPTX — roadmap следующей итерации</ns0:t>
+      </ns0:r>
+    </ns0:p>
+    <ns0:p ns3:paraId="AA000003" ns3:textId="77777777" ns0:rsidR="00270EF2" ns0:rsidRDefault="00000000">
+      <ns0:pPr>
+        <ns0:pStyle ns0:val="a0"/>
+        <ns0:ind ns0:start="283"/>
+        <ns0:rPr>
+          <ns0:lang ns0:val="ru-RU"/>
+        </ns0:rPr>
+      </ns0:pPr>
+      <ns0:r>
+        <ns0:rPr>
+          <ns0:lang ns0:val="ru-RU"/>
+        </ns0:rPr>
+        <ns0:t xml:space="preserve">Оркестрация: FastAPI + Python chain (выбрано) vs LangChain/LangGraph — меньше зависимостей, полный контроль над промптами</ns0:t>
+      </ns0:r>
+    </ns0:p>
     <ns0:p ns3:paraId="408B0FF7" ns3:textId="3D22287E" ns0:rsidR="00270EF2" ns0:rsidRDefault="00000000" ns2:_id="vyd:000000000000xr">
       <ns0:pPr>
         <ns0:pStyle ns0:val="21"/>
@@ -4029,7 +4385,7 @@
         <ns0:rPr>
           <ns0:color ns0:val="1F4E79"/>
         </ns0:rPr>
-        <ns0:t ns2:_id="vyd:000000000000wv">6.3. Топ-3 риска</ns0:t>
+        <ns0:t ns2:_id="vyd:000000000000wv">6.3. Топ-5 рисков (AI + технические + безопасность)</ns0:t>
       </ns0:r>
     </ns0:p>
     <ns0:tbl ns2:_id="vyd:000000000000vg">

</xml_diff>